<commit_message>
docs(hdsd): sửa hai khẳng định sai và thu hẹp câu kết đúng phạm vi đã kiểm
- 'tải được cả PDF và XML' — SAI. portal_einvoice_download chỉ nhận
  loai='pdf'|'nhap'; docstring của chính nó ghi module HĐĐT không có field
  xml, không có gì để giao. Đã đối chiếu code.
- 'khách nhận email kèm PDF báo giá' — SAI. install_notifications.py CỐ Ý
  không đặt attach_print/print_format (review I-1), và site này chưa cấu hình
  tài khoản gửi thư. PDF lấy trên cổng.
- Câu kết nhận '988 test' cho toàn bộ tài liệu, trong khi giao diện Desk chưa
  ai soát bằng mắt. Thu hẹp lại đúng những gì đã kiểm.
- Thêm điều kiện tiên quyết 'bench build --app miyano_portal' cho ba nút Desk,
  và hai dòng sự cố tương ứng.

Hai chỗ đầu là chính em viết theo trí nhớ thay vì đối chiếu code — đúng loại
sai mà một bản hướng dẫn không được phép mang.

Co-Authored-By: Claude Opus 5 (1M context) <noreply@anthropic.com>
</commit_message>
<xml_diff>
--- a/docs/HDSD-hai-vai-khach-hang-va-nhan-vien.docx
+++ b/docs/HDSD-hai-vai-khach-hang-va-nhan-vien.docx
@@ -3535,14 +3535,14 @@
           <w:sz w:val="21"/>
           <w:szCs w:val="21"/>
         </w:rPr>
-        <w:t xml:space="preserve">thông báo</w:t>
-      </w:r>
-      <w:r>
-        <w:rPr>
-          <w:sz w:val="21"/>
-          <w:szCs w:val="21"/>
-        </w:rPr>
-        <w:t xml:space="preserve"> và đơn chuyển sang trạng thái </w:t>
+        <w:t xml:space="preserve">thông báo trên cổng</w:t>
+      </w:r>
+      <w:r>
+        <w:rPr>
+          <w:sz w:val="21"/>
+          <w:szCs w:val="21"/>
+        </w:rPr>
+        <w:t xml:space="preserve"> (chuông 🔔) và đơn chuyển sang trạng thái </w:t>
       </w:r>
       <w:r>
         <w:rPr>
@@ -3881,7 +3881,7 @@
                 <w:sz w:val="18"/>
                 <w:szCs w:val="18"/>
               </w:rPr>
-              <w:t xml:space="preserve">, cần nêu lý do. Đơn đóng lại, hai bên nhận email</w:t>
+              <w:t xml:space="preserve">, cần nêu lý do. Đơn đóng lại; email báo hai bên nếu site đã cấu hình tài khoản gửi thư</w:t>
             </w:r>
           </w:p>
         </w:tc>
@@ -3993,7 +3993,40 @@
           <w:sz w:val="21"/>
           <w:szCs w:val="21"/>
         </w:rPr>
-        <w:t xml:space="preserve"> bằng nút ⬇ trong khối báo giá.</w:t>
+        <w:t xml:space="preserve"> bằng nút ⬇ trong khối báo giá. Bản PDF </w:t>
+      </w:r>
+      <w:r>
+        <w:rPr>
+          <w:b/>
+          <w:bCs/>
+          <w:sz w:val="21"/>
+          <w:szCs w:val="21"/>
+        </w:rPr>
+        <w:t xml:space="preserve">lấy trên cổng</w:t>
+      </w:r>
+      <w:r>
+        <w:rPr>
+          <w:sz w:val="21"/>
+          <w:szCs w:val="21"/>
+        </w:rPr>
+        <w:t xml:space="preserve">, không đính kèm trong email — xem ghi chú về email ở </w:t>
+      </w:r>
+      <w:r>
+        <w:rPr>
+          <w:i/>
+          <w:iCs/>
+          <w:color w:val="1F4E79"/>
+          <w:sz w:val="21"/>
+          <w:szCs w:val="21"/>
+        </w:rPr>
+        <w:t xml:space="preserve">D</w:t>
+      </w:r>
+      <w:r>
+        <w:rPr>
+          <w:sz w:val="21"/>
+          <w:szCs w:val="21"/>
+        </w:rPr>
+        <w:t xml:space="preserve">.</w:t>
       </w:r>
     </w:p>
     <w:p>
@@ -6517,23 +6550,67 @@
           <w:sz w:val="21"/>
           <w:szCs w:val="21"/>
         </w:rPr>
-        <w:t xml:space="preserve"> để tải hoá đơn. Với hoá đơn điện tử đã phát hành, tải được cả </w:t>
-      </w:r>
-      <w:r>
-        <w:rPr>
-          <w:b/>
-          <w:bCs/>
-          <w:sz w:val="21"/>
-          <w:szCs w:val="21"/>
-        </w:rPr>
-        <w:t xml:space="preserve">PDF và XML</w:t>
-      </w:r>
-      <w:r>
-        <w:rPr>
-          <w:sz w:val="21"/>
-          <w:szCs w:val="21"/>
-        </w:rPr>
-        <w:t xml:space="preserve">.</w:t>
+        <w:t xml:space="preserve"> để tải hoá đơn.</w:t>
+      </w:r>
+    </w:p>
+    <w:p>
+      <w:pPr>
+        <w:spacing w:after="100"/>
+      </w:pPr>
+      <w:r>
+        <w:rPr>
+          <w:sz w:val="21"/>
+          <w:szCs w:val="21"/>
+        </w:rPr>
+        <w:t xml:space="preserve">Với hoá đơn điện tử: tải được </w:t>
+      </w:r>
+      <w:r>
+        <w:rPr>
+          <w:b/>
+          <w:bCs/>
+          <w:sz w:val="21"/>
+          <w:szCs w:val="21"/>
+        </w:rPr>
+        <w:t xml:space="preserve">bản thể hiện PDF</w:t>
+      </w:r>
+      <w:r>
+        <w:rPr>
+          <w:sz w:val="21"/>
+          <w:szCs w:val="21"/>
+        </w:rPr>
+        <w:t xml:space="preserve"> của hoá đơn đã phát hành, và </w:t>
+      </w:r>
+      <w:r>
+        <w:rPr>
+          <w:b/>
+          <w:bCs/>
+          <w:sz w:val="21"/>
+          <w:szCs w:val="21"/>
+        </w:rPr>
+        <w:t xml:space="preserve">bản in thử PDF</w:t>
+      </w:r>
+      <w:r>
+        <w:rPr>
+          <w:sz w:val="21"/>
+          <w:szCs w:val="21"/>
+        </w:rPr>
+        <w:t xml:space="preserve"> khi chứng từ còn ở dạng nháp (xem trong khối Giao hàng của chi tiết đơn). Hệ thống </w:t>
+      </w:r>
+      <w:r>
+        <w:rPr>
+          <w:b/>
+          <w:bCs/>
+          <w:sz w:val="21"/>
+          <w:szCs w:val="21"/>
+        </w:rPr>
+        <w:t xml:space="preserve">không phát hành file XML</w:t>
+      </w:r>
+      <w:r>
+        <w:rPr>
+          <w:sz w:val="21"/>
+          <w:szCs w:val="21"/>
+        </w:rPr>
+        <w:t xml:space="preserve"> — module hoá đơn điện tử đang dùng không lưu XML, nên không có gì để giao.</w:t>
       </w:r>
     </w:p>
     <w:p>
@@ -7840,7 +7917,23 @@
           <w:sz w:val="21"/>
           <w:szCs w:val="21"/>
         </w:rPr>
-        <w:t xml:space="preserve">, khách nhận thông báo và email kèm </w:t>
+        <w:t xml:space="preserve">, khách nhận </w:t>
+      </w:r>
+      <w:r>
+        <w:rPr>
+          <w:b/>
+          <w:bCs/>
+          <w:sz w:val="21"/>
+          <w:szCs w:val="21"/>
+        </w:rPr>
+        <w:t xml:space="preserve">thông báo trên cổng</w:t>
+      </w:r>
+      <w:r>
+        <w:rPr>
+          <w:sz w:val="21"/>
+          <w:szCs w:val="21"/>
+        </w:rPr>
+        <w:t xml:space="preserve"> và tự tải được </w:t>
       </w:r>
       <w:r>
         <w:rPr>
@@ -7850,6 +7943,39 @@
           <w:szCs w:val="21"/>
         </w:rPr>
         <w:t xml:space="preserve">PDF báo giá</w:t>
+      </w:r>
+      <w:r>
+        <w:rPr>
+          <w:sz w:val="21"/>
+          <w:szCs w:val="21"/>
+        </w:rPr>
+        <w:t xml:space="preserve"> ở đó. PDF </w:t>
+      </w:r>
+      <w:r>
+        <w:rPr>
+          <w:b/>
+          <w:bCs/>
+          <w:sz w:val="21"/>
+          <w:szCs w:val="21"/>
+        </w:rPr>
+        <w:t xml:space="preserve">cố ý không đính kèm email</w:t>
+      </w:r>
+      <w:r>
+        <w:rPr>
+          <w:sz w:val="21"/>
+          <w:szCs w:val="21"/>
+        </w:rPr>
+        <w:t xml:space="preserve"> — xem </w:t>
+      </w:r>
+      <w:r>
+        <w:rPr>
+          <w:i/>
+          <w:iCs/>
+          <w:color w:val="1F4E79"/>
+          <w:sz w:val="21"/>
+          <w:szCs w:val="21"/>
+        </w:rPr>
+        <w:t xml:space="preserve">D</w:t>
       </w:r>
       <w:r>
         <w:rPr>
@@ -9074,6 +9200,22 @@
           <w:szCs w:val="21"/>
         </w:rPr>
         <w:t xml:space="preserve">Miyano → Biên bản kiểm hàng</w:t>
+      </w:r>
+      <w:r>
+        <w:rPr>
+          <w:sz w:val="21"/>
+          <w:szCs w:val="21"/>
+        </w:rPr>
+        <w:t xml:space="preserve"> </w:t>
+      </w:r>
+      <w:r>
+        <w:rPr>
+          <w:i/>
+          <w:iCs/>
+          <w:sz w:val="21"/>
+          <w:szCs w:val="21"/>
+        </w:rPr>
+        <w:t xml:space="preserve">(nút này do app nạp vào Desk; không thấy nút → chạy `bench build --app miyano_portal` rồi tải lại trang, xem [D](#d--sự-cố-thường-gặp))</w:t>
       </w:r>
     </w:p>
     <w:p>
@@ -13469,9 +13611,9 @@
         <w:tblLayout w:type="fixed"/>
       </w:tblPr>
       <w:tblGrid>
-        <w:gridCol w:w="2959"/>
-        <w:gridCol w:w="3423"/>
-        <w:gridCol w:w="3482"/>
+        <w:gridCol w:w="3307"/>
+        <w:gridCol w:w="3251"/>
+        <w:gridCol w:w="3306"/>
       </w:tblGrid>
       <w:tr>
         <w:trPr>
@@ -13479,7 +13621,7 @@
         </w:trPr>
         <w:tc>
           <w:tcPr>
-            <w:tcW w:type="dxa" w:w="2959"/>
+            <w:tcW w:type="dxa" w:w="3307"/>
             <w:shd w:fill="E8EEF5" w:val="clear"/>
             <w:tcMar>
               <w:top w:type="dxa" w:w="57"/>
@@ -13507,7 +13649,7 @@
         </w:tc>
         <w:tc>
           <w:tcPr>
-            <w:tcW w:type="dxa" w:w="3423"/>
+            <w:tcW w:type="dxa" w:w="3251"/>
             <w:shd w:fill="E8EEF5" w:val="clear"/>
             <w:tcMar>
               <w:top w:type="dxa" w:w="57"/>
@@ -13535,7 +13677,7 @@
         </w:tc>
         <w:tc>
           <w:tcPr>
-            <w:tcW w:type="dxa" w:w="3482"/>
+            <w:tcW w:type="dxa" w:w="3306"/>
             <w:shd w:fill="E8EEF5" w:val="clear"/>
             <w:tcMar>
               <w:top w:type="dxa" w:w="57"/>
@@ -13568,7 +13710,7 @@
         </w:trPr>
         <w:tc>
           <w:tcPr>
-            <w:tcW w:type="dxa" w:w="2959"/>
+            <w:tcW w:type="dxa" w:w="3307"/>
             <w:tcMar>
               <w:top w:type="dxa" w:w="57"/>
               <w:left w:type="dxa" w:w="85"/>
@@ -13603,7 +13745,7 @@
         </w:tc>
         <w:tc>
           <w:tcPr>
-            <w:tcW w:type="dxa" w:w="3423"/>
+            <w:tcW w:type="dxa" w:w="3251"/>
             <w:tcMar>
               <w:top w:type="dxa" w:w="57"/>
               <w:left w:type="dxa" w:w="85"/>
@@ -13629,7 +13771,7 @@
         </w:tc>
         <w:tc>
           <w:tcPr>
-            <w:tcW w:type="dxa" w:w="3482"/>
+            <w:tcW w:type="dxa" w:w="3306"/>
             <w:tcMar>
               <w:top w:type="dxa" w:w="57"/>
               <w:left w:type="dxa" w:w="85"/>
@@ -13660,7 +13802,7 @@
         </w:trPr>
         <w:tc>
           <w:tcPr>
-            <w:tcW w:type="dxa" w:w="2959"/>
+            <w:tcW w:type="dxa" w:w="3307"/>
             <w:tcMar>
               <w:top w:type="dxa" w:w="57"/>
               <w:left w:type="dxa" w:w="85"/>
@@ -13697,7 +13839,7 @@
         </w:tc>
         <w:tc>
           <w:tcPr>
-            <w:tcW w:type="dxa" w:w="3423"/>
+            <w:tcW w:type="dxa" w:w="3251"/>
             <w:tcMar>
               <w:top w:type="dxa" w:w="57"/>
               <w:left w:type="dxa" w:w="85"/>
@@ -13723,7 +13865,7 @@
         </w:tc>
         <w:tc>
           <w:tcPr>
-            <w:tcW w:type="dxa" w:w="3482"/>
+            <w:tcW w:type="dxa" w:w="3306"/>
             <w:tcMar>
               <w:top w:type="dxa" w:w="57"/>
               <w:left w:type="dxa" w:w="85"/>
@@ -13754,7 +13896,7 @@
         </w:trPr>
         <w:tc>
           <w:tcPr>
-            <w:tcW w:type="dxa" w:w="2959"/>
+            <w:tcW w:type="dxa" w:w="3307"/>
             <w:tcMar>
               <w:top w:type="dxa" w:w="57"/>
               <w:left w:type="dxa" w:w="85"/>
@@ -13780,7 +13922,7 @@
         </w:tc>
         <w:tc>
           <w:tcPr>
-            <w:tcW w:type="dxa" w:w="3423"/>
+            <w:tcW w:type="dxa" w:w="3251"/>
             <w:tcMar>
               <w:top w:type="dxa" w:w="57"/>
               <w:left w:type="dxa" w:w="85"/>
@@ -13818,7 +13960,7 @@
         </w:tc>
         <w:tc>
           <w:tcPr>
-            <w:tcW w:type="dxa" w:w="3482"/>
+            <w:tcW w:type="dxa" w:w="3306"/>
             <w:tcMar>
               <w:top w:type="dxa" w:w="57"/>
               <w:left w:type="dxa" w:w="85"/>
@@ -13849,7 +13991,7 @@
         </w:trPr>
         <w:tc>
           <w:tcPr>
-            <w:tcW w:type="dxa" w:w="2959"/>
+            <w:tcW w:type="dxa" w:w="3307"/>
             <w:tcMar>
               <w:top w:type="dxa" w:w="57"/>
               <w:left w:type="dxa" w:w="85"/>
@@ -13886,7 +14028,7 @@
         </w:tc>
         <w:tc>
           <w:tcPr>
-            <w:tcW w:type="dxa" w:w="3423"/>
+            <w:tcW w:type="dxa" w:w="3251"/>
             <w:tcMar>
               <w:top w:type="dxa" w:w="57"/>
               <w:left w:type="dxa" w:w="85"/>
@@ -13912,7 +14054,7 @@
         </w:tc>
         <w:tc>
           <w:tcPr>
-            <w:tcW w:type="dxa" w:w="3482"/>
+            <w:tcW w:type="dxa" w:w="3306"/>
             <w:tcMar>
               <w:top w:type="dxa" w:w="57"/>
               <w:left w:type="dxa" w:w="85"/>
@@ -13943,7 +14085,7 @@
         </w:trPr>
         <w:tc>
           <w:tcPr>
-            <w:tcW w:type="dxa" w:w="2959"/>
+            <w:tcW w:type="dxa" w:w="3307"/>
             <w:tcMar>
               <w:top w:type="dxa" w:w="57"/>
               <w:left w:type="dxa" w:w="85"/>
@@ -13971,7 +14113,7 @@
         </w:tc>
         <w:tc>
           <w:tcPr>
-            <w:tcW w:type="dxa" w:w="3423"/>
+            <w:tcW w:type="dxa" w:w="3251"/>
             <w:tcMar>
               <w:top w:type="dxa" w:w="57"/>
               <w:left w:type="dxa" w:w="85"/>
@@ -13997,7 +14139,7 @@
         </w:tc>
         <w:tc>
           <w:tcPr>
-            <w:tcW w:type="dxa" w:w="3482"/>
+            <w:tcW w:type="dxa" w:w="3306"/>
             <w:tcMar>
               <w:top w:type="dxa" w:w="57"/>
               <w:left w:type="dxa" w:w="85"/>
@@ -14046,7 +14188,7 @@
         </w:trPr>
         <w:tc>
           <w:tcPr>
-            <w:tcW w:type="dxa" w:w="2959"/>
+            <w:tcW w:type="dxa" w:w="3307"/>
             <w:tcMar>
               <w:top w:type="dxa" w:w="57"/>
               <w:left w:type="dxa" w:w="85"/>
@@ -14072,7 +14214,7 @@
         </w:tc>
         <w:tc>
           <w:tcPr>
-            <w:tcW w:type="dxa" w:w="3423"/>
+            <w:tcW w:type="dxa" w:w="3251"/>
             <w:tcMar>
               <w:top w:type="dxa" w:w="57"/>
               <w:left w:type="dxa" w:w="85"/>
@@ -14098,7 +14240,7 @@
         </w:tc>
         <w:tc>
           <w:tcPr>
-            <w:tcW w:type="dxa" w:w="3482"/>
+            <w:tcW w:type="dxa" w:w="3306"/>
             <w:tcMar>
               <w:top w:type="dxa" w:w="57"/>
               <w:left w:type="dxa" w:w="85"/>
@@ -14138,7 +14280,7 @@
         </w:trPr>
         <w:tc>
           <w:tcPr>
-            <w:tcW w:type="dxa" w:w="2959"/>
+            <w:tcW w:type="dxa" w:w="3307"/>
             <w:tcMar>
               <w:top w:type="dxa" w:w="57"/>
               <w:left w:type="dxa" w:w="85"/>
@@ -14164,7 +14306,7 @@
         </w:tc>
         <w:tc>
           <w:tcPr>
-            <w:tcW w:type="dxa" w:w="3423"/>
+            <w:tcW w:type="dxa" w:w="3251"/>
             <w:tcMar>
               <w:top w:type="dxa" w:w="57"/>
               <w:left w:type="dxa" w:w="85"/>
@@ -14190,7 +14332,7 @@
         </w:tc>
         <w:tc>
           <w:tcPr>
-            <w:tcW w:type="dxa" w:w="3482"/>
+            <w:tcW w:type="dxa" w:w="3306"/>
             <w:tcMar>
               <w:top w:type="dxa" w:w="57"/>
               <w:left w:type="dxa" w:w="85"/>
@@ -14221,7 +14363,7 @@
         </w:trPr>
         <w:tc>
           <w:tcPr>
-            <w:tcW w:type="dxa" w:w="2959"/>
+            <w:tcW w:type="dxa" w:w="3307"/>
             <w:tcMar>
               <w:top w:type="dxa" w:w="57"/>
               <w:left w:type="dxa" w:w="85"/>
@@ -14247,7 +14389,7 @@
         </w:tc>
         <w:tc>
           <w:tcPr>
-            <w:tcW w:type="dxa" w:w="3423"/>
+            <w:tcW w:type="dxa" w:w="3251"/>
             <w:tcMar>
               <w:top w:type="dxa" w:w="57"/>
               <w:left w:type="dxa" w:w="85"/>
@@ -14273,7 +14415,7 @@
         </w:tc>
         <w:tc>
           <w:tcPr>
-            <w:tcW w:type="dxa" w:w="3482"/>
+            <w:tcW w:type="dxa" w:w="3306"/>
             <w:tcMar>
               <w:top w:type="dxa" w:w="57"/>
               <w:left w:type="dxa" w:w="85"/>
@@ -14325,7 +14467,7 @@
         </w:trPr>
         <w:tc>
           <w:tcPr>
-            <w:tcW w:type="dxa" w:w="2959"/>
+            <w:tcW w:type="dxa" w:w="3307"/>
             <w:tcMar>
               <w:top w:type="dxa" w:w="57"/>
               <w:left w:type="dxa" w:w="85"/>
@@ -14351,7 +14493,7 @@
         </w:tc>
         <w:tc>
           <w:tcPr>
-            <w:tcW w:type="dxa" w:w="3423"/>
+            <w:tcW w:type="dxa" w:w="3251"/>
             <w:tcMar>
               <w:top w:type="dxa" w:w="57"/>
               <w:left w:type="dxa" w:w="85"/>
@@ -14377,7 +14519,7 @@
         </w:tc>
         <w:tc>
           <w:tcPr>
-            <w:tcW w:type="dxa" w:w="3482"/>
+            <w:tcW w:type="dxa" w:w="3306"/>
             <w:tcMar>
               <w:top w:type="dxa" w:w="57"/>
               <w:left w:type="dxa" w:w="85"/>
@@ -14441,6 +14583,229 @@
           </w:p>
         </w:tc>
       </w:tr>
+      <w:tr>
+        <w:trPr>
+          <w:tblHeader w:val="false"/>
+        </w:trPr>
+        <w:tc>
+          <w:tcPr>
+            <w:tcW w:type="dxa" w:w="3307"/>
+            <w:tcMar>
+              <w:top w:type="dxa" w:w="57"/>
+              <w:left w:type="dxa" w:w="85"/>
+              <w:bottom w:type="dxa" w:w="57"/>
+              <w:right w:type="dxa" w:w="85"/>
+            </w:tcMar>
+            <w:vAlign w:val="top"/>
+          </w:tcPr>
+          <w:p>
+            <w:pPr>
+              <w:spacing w:before="0" w:after="0"/>
+            </w:pPr>
+            <w:r>
+              <w:rPr>
+                <w:b w:val="false"/>
+                <w:bCs w:val="false"/>
+                <w:sz w:val="18"/>
+                <w:szCs w:val="18"/>
+              </w:rPr>
+              <w:t xml:space="preserve">Không thấy nút </w:t>
+            </w:r>
+            <w:r>
+              <w:rPr>
+                <w:b/>
+                <w:bCs/>
+                <w:sz w:val="18"/>
+                <w:szCs w:val="18"/>
+              </w:rPr>
+              <w:t xml:space="preserve">Miyano</w:t>
+            </w:r>
+            <w:r>
+              <w:rPr>
+                <w:b w:val="false"/>
+                <w:bCs w:val="false"/>
+                <w:sz w:val="18"/>
+                <w:szCs w:val="18"/>
+              </w:rPr>
+              <w:t xml:space="preserve"> trên Sales Order / Delivery Note</w:t>
+            </w:r>
+          </w:p>
+        </w:tc>
+        <w:tc>
+          <w:tcPr>
+            <w:tcW w:type="dxa" w:w="3251"/>
+            <w:tcMar>
+              <w:top w:type="dxa" w:w="57"/>
+              <w:left w:type="dxa" w:w="85"/>
+              <w:bottom w:type="dxa" w:w="57"/>
+              <w:right w:type="dxa" w:w="85"/>
+            </w:tcMar>
+            <w:vAlign w:val="top"/>
+          </w:tcPr>
+          <w:p>
+            <w:pPr>
+              <w:spacing w:before="0" w:after="0"/>
+            </w:pPr>
+            <w:r>
+              <w:rPr>
+                <w:b w:val="false"/>
+                <w:bCs w:val="false"/>
+                <w:sz w:val="18"/>
+                <w:szCs w:val="18"/>
+              </w:rPr>
+              <w:t xml:space="preserve">Asset của app chưa được build trên site</w:t>
+            </w:r>
+          </w:p>
+        </w:tc>
+        <w:tc>
+          <w:tcPr>
+            <w:tcW w:type="dxa" w:w="3306"/>
+            <w:tcMar>
+              <w:top w:type="dxa" w:w="57"/>
+              <w:left w:type="dxa" w:w="85"/>
+              <w:bottom w:type="dxa" w:w="57"/>
+              <w:right w:type="dxa" w:w="85"/>
+            </w:tcMar>
+            <w:vAlign w:val="top"/>
+          </w:tcPr>
+          <w:p>
+            <w:pPr>
+              <w:spacing w:before="0" w:after="0"/>
+            </w:pPr>
+            <w:r>
+              <w:rPr>
+                <w:b w:val="false"/>
+                <w:bCs w:val="false"/>
+                <w:color w:val="0B4F46"/>
+                <w:sz w:val="16"/>
+                <w:szCs w:val="16"/>
+                <w:rFonts w:ascii="Consolas" w:cs="Consolas" w:eastAsia="Consolas" w:hAnsi="Consolas"/>
+                <w:shd w:fill="EDF3F2" w:val="clear"/>
+              </w:rPr>
+              <w:t xml:space="preserve">bench build --app miyano_portal</w:t>
+            </w:r>
+            <w:r>
+              <w:rPr>
+                <w:b w:val="false"/>
+                <w:bCs w:val="false"/>
+                <w:sz w:val="18"/>
+                <w:szCs w:val="18"/>
+              </w:rPr>
+              <w:t xml:space="preserve"> rồi Ctrl+Shift+R</w:t>
+            </w:r>
+          </w:p>
+        </w:tc>
+      </w:tr>
+      <w:tr>
+        <w:trPr>
+          <w:tblHeader w:val="false"/>
+        </w:trPr>
+        <w:tc>
+          <w:tcPr>
+            <w:tcW w:type="dxa" w:w="3307"/>
+            <w:tcMar>
+              <w:top w:type="dxa" w:w="57"/>
+              <w:left w:type="dxa" w:w="85"/>
+              <w:bottom w:type="dxa" w:w="57"/>
+              <w:right w:type="dxa" w:w="85"/>
+            </w:tcMar>
+            <w:vAlign w:val="top"/>
+          </w:tcPr>
+          <w:p>
+            <w:pPr>
+              <w:spacing w:before="0" w:after="0"/>
+            </w:pPr>
+            <w:r>
+              <w:rPr>
+                <w:b w:val="false"/>
+                <w:bCs w:val="false"/>
+                <w:sz w:val="18"/>
+                <w:szCs w:val="18"/>
+              </w:rPr>
+              <w:t xml:space="preserve">Khách báo không nhận được </w:t>
+            </w:r>
+            <w:r>
+              <w:rPr>
+                <w:b/>
+                <w:bCs/>
+                <w:sz w:val="18"/>
+                <w:szCs w:val="18"/>
+              </w:rPr>
+              <w:t xml:space="preserve">email</w:t>
+            </w:r>
+            <w:r>
+              <w:rPr>
+                <w:b w:val="false"/>
+                <w:bCs w:val="false"/>
+                <w:sz w:val="18"/>
+                <w:szCs w:val="18"/>
+              </w:rPr>
+              <w:t xml:space="preserve"> (thông báo trên cổng vẫn có)</w:t>
+            </w:r>
+          </w:p>
+        </w:tc>
+        <w:tc>
+          <w:tcPr>
+            <w:tcW w:type="dxa" w:w="3251"/>
+            <w:tcMar>
+              <w:top w:type="dxa" w:w="57"/>
+              <w:left w:type="dxa" w:w="85"/>
+              <w:bottom w:type="dxa" w:w="57"/>
+              <w:right w:type="dxa" w:w="85"/>
+            </w:tcMar>
+            <w:vAlign w:val="top"/>
+          </w:tcPr>
+          <w:p>
+            <w:pPr>
+              <w:spacing w:before="0" w:after="0"/>
+            </w:pPr>
+            <w:r>
+              <w:rPr>
+                <w:b w:val="false"/>
+                <w:bCs w:val="false"/>
+                <w:sz w:val="18"/>
+                <w:szCs w:val="18"/>
+              </w:rPr>
+              <w:t xml:space="preserve">Site chưa cấu hình </w:t>
+            </w:r>
+            <w:r>
+              <w:rPr>
+                <w:b/>
+                <w:bCs/>
+                <w:sz w:val="18"/>
+                <w:szCs w:val="18"/>
+              </w:rPr>
+              <w:t xml:space="preserve">Email Account gửi ra</w:t>
+            </w:r>
+          </w:p>
+        </w:tc>
+        <w:tc>
+          <w:tcPr>
+            <w:tcW w:type="dxa" w:w="3306"/>
+            <w:tcMar>
+              <w:top w:type="dxa" w:w="57"/>
+              <w:left w:type="dxa" w:w="85"/>
+              <w:bottom w:type="dxa" w:w="57"/>
+              <w:right w:type="dxa" w:w="85"/>
+            </w:tcMar>
+            <w:vAlign w:val="top"/>
+          </w:tcPr>
+          <w:p>
+            <w:pPr>
+              <w:spacing w:before="0" w:after="0"/>
+            </w:pPr>
+            <w:r>
+              <w:rPr>
+                <w:b w:val="false"/>
+                <w:bCs w:val="false"/>
+                <w:sz w:val="18"/>
+                <w:szCs w:val="18"/>
+              </w:rPr>
+              <w:t xml:space="preserve">Desk → Email Account → thêm tài khoản gửi. Mọi thông báo trên cổng vẫn chạy độc lập với email</w:t>
+            </w:r>
+          </w:p>
+        </w:tc>
+      </w:tr>
     </w:tbl>
     <w:p>
       <w:pPr>
@@ -14745,7 +15110,75 @@
           <w:sz w:val="21"/>
           <w:szCs w:val="21"/>
         </w:rPr>
-        <w:t xml:space="preserve">Tài liệu này mô tả hệ thống tại thời điểm 16/08/2026. Mọi luồng nêu ở đây đều đã được kiểm thử tự động (988 test) và chạy thử hai vai trên dữ liệu thật.</w:t>
+        <w:t xml:space="preserve">Tài liệu này mô tả hệ thống tại thời điểm 16/08/2026.</w:t>
+      </w:r>
+    </w:p>
+    <w:p>
+      <w:pPr>
+        <w:spacing w:after="100"/>
+      </w:pPr>
+      <w:r>
+        <w:rPr>
+          <w:i/>
+          <w:iCs/>
+          <w:sz w:val="21"/>
+          <w:szCs w:val="21"/>
+        </w:rPr>
+        <w:t xml:space="preserve">Phạm vi đã kiểm chứng: toàn bộ </w:t>
+      </w:r>
+      <w:r>
+        <w:rPr>
+          <w:i/>
+          <w:iCs/>
+          <w:sz w:val="21"/>
+          <w:szCs w:val="21"/>
+        </w:rPr>
+        <w:t xml:space="preserve">luồng nghiệp vụ</w:t>
+      </w:r>
+      <w:r>
+        <w:rPr>
+          <w:i/>
+          <w:iCs/>
+          <w:sz w:val="21"/>
+          <w:szCs w:val="21"/>
+        </w:rPr>
+        <w:t xml:space="preserve"> của cả hai vai đã được kiểm thử tự động (988 test) và chạy thử trên dữ liệu thật; </w:t>
+      </w:r>
+      <w:r>
+        <w:rPr>
+          <w:i/>
+          <w:iCs/>
+          <w:sz w:val="21"/>
+          <w:szCs w:val="21"/>
+        </w:rPr>
+        <w:t xml:space="preserve">màn hình cổng khách hàng</w:t>
+      </w:r>
+      <w:r>
+        <w:rPr>
+          <w:i/>
+          <w:iCs/>
+          <w:sz w:val="21"/>
+          <w:szCs w:val="21"/>
+        </w:rPr>
+        <w:t xml:space="preserve"> đã được soát bằng mắt trên trình duyệt. </w:t>
+      </w:r>
+      <w:r>
+        <w:rPr>
+          <w:i/>
+          <w:iCs/>
+          <w:sz w:val="21"/>
+          <w:szCs w:val="21"/>
+        </w:rPr>
+        <w:t xml:space="preserve">Giao diện Desk</w:t>
+      </w:r>
+      <w:r>
+        <w:rPr>
+          <w:i/>
+          <w:iCs/>
+          <w:sz w:val="21"/>
+          <w:szCs w:val="21"/>
+        </w:rPr>
+        <w:t xml:space="preserve"> (ba nhóm nút mô tả ở B4–B7) chưa được soát bằng mắt tại thời điểm phát hành tài liệu — nếu thấy khác mô tả, báo lại để cập nhật.</w:t>
       </w:r>
     </w:p>
     <w:sectPr>

</xml_diff>

<commit_message>
docs: nói đúng giá về 0, và bỏ phép kiểm patch gắn cứng một bản
Hai chỗ tự soát lại bắt được:

- B2 hứa rằng dòng hàng hệ thống tự dựng sẽ "để trống giá" khi mã không
  thuộc hợp đồng nào. Thực tế đơn giá về 0, và chốt chặn lúc gửi khách
  duyệt lại đọc đúng số 0 đó rồi báo "Thiếu giá". Nhân viên làm theo tài
  liệu sẽ đi tìm một ô trống không tồn tại. Nói thẳng: giá về 0, điền lại.
- Checklist triển khai kiểm patch bằng một truy vấn gắn cứng ba cột của
  bản phân quyền, kèm câu "bản này có hai patch". Người cài bản mới chạy
  truy vấn đó, thấy đủ ba cột và kết luận migrate đã xong, trong khi cột
  của bản đang cài chưa được kiểm gì. Đổi sang cách kiểm đúng cho mọi bản.

Sinh lại hai bản .docx.

Co-Authored-By: Claude Opus 5 (1M context) <noreply@anthropic.com>
</commit_message>
<xml_diff>
--- a/docs/HDSD-hai-vai-khach-hang-va-nhan-vien.docx
+++ b/docs/HDSD-hai-vai-khach-hang-va-nhan-vien.docx
@@ -6410,7 +6410,69 @@
           <w:b w:val="0"/>
           <w:i w:val="0"/>
         </w:rPr>
-        <w:t xml:space="preserve">, lấy giá hợp đồng nếu mã đó nằm trong hợp đồng còn hiệu lực của khách, để trống giá nếu không. Dòng giữ chỗ </w:t>
+        <w:t xml:space="preserve">. Nếu mã đó nằm trong hợp đồng còn hiệu lực của khách thì dòng mang luôn giá hợp đồng; </w:t>
+      </w:r>
+      <w:r>
+        <w:rPr>
+          <w:b/>
+          <w:i w:val="0"/>
+        </w:rPr>
+        <w:t xml:space="preserve">nếu không thì đơn giá về </w:t>
+      </w:r>
+      <w:r>
+        <w:rPr>
+          <w:rFonts w:ascii="Consolas" w:hAnsi="Consolas"/>
+          <w:b/>
+          <w:i w:val="0"/>
+          <w:color w:val="B03030"/>
+          <w:sz w:val="19"/>
+        </w:rPr>
+        <w:t>0</w:t>
+      </w:r>
+      <w:r>
+        <w:rPr>
+          <w:b/>
+          <w:i w:val="0"/>
+        </w:rPr>
+        <w:t xml:space="preserve"> và bạn phải điền lại</w:t>
+      </w:r>
+      <w:r>
+        <w:rPr>
+          <w:b w:val="0"/>
+          <w:i w:val="0"/>
+        </w:rPr>
+        <w:t xml:space="preserve"> — để nguyên </w:t>
+      </w:r>
+      <w:r>
+        <w:rPr>
+          <w:rFonts w:ascii="Consolas" w:hAnsi="Consolas"/>
+          <w:b w:val="0"/>
+          <w:i w:val="0"/>
+          <w:color w:val="B03030"/>
+          <w:sz w:val="19"/>
+        </w:rPr>
+        <w:t>0</w:t>
+      </w:r>
+      <w:r>
+        <w:rPr>
+          <w:b w:val="0"/>
+          <w:i w:val="0"/>
+        </w:rPr>
+        <w:t xml:space="preserve"> sẽ ăn chốt </w:t>
+      </w:r>
+      <w:r>
+        <w:rPr>
+          <w:b w:val="0"/>
+          <w:i/>
+        </w:rPr>
+        <w:t>"Thiếu giá"</w:t>
+      </w:r>
+      <w:r>
+        <w:rPr>
+          <w:b w:val="0"/>
+          <w:i w:val="0"/>
+        </w:rPr>
+        <w:t xml:space="preserve"> lúc gửi khách duyệt. Dòng giữ chỗ </w:t>
       </w:r>
       <w:r>
         <w:rPr>
@@ -6462,7 +6524,24 @@
           <w:b w:val="0"/>
           <w:i w:val="0"/>
         </w:rPr>
-        <w:t xml:space="preserve"> cho những dòng còn để trống trong bảng </w:t>
+        <w:t xml:space="preserve"> cho những dòng đang là </w:t>
+      </w:r>
+      <w:r>
+        <w:rPr>
+          <w:rFonts w:ascii="Consolas" w:hAnsi="Consolas"/>
+          <w:b w:val="0"/>
+          <w:i w:val="0"/>
+          <w:color w:val="B03030"/>
+          <w:sz w:val="19"/>
+        </w:rPr>
+        <w:t>0</w:t>
+      </w:r>
+      <w:r>
+        <w:rPr>
+          <w:b w:val="0"/>
+          <w:i w:val="0"/>
+        </w:rPr>
+        <w:t xml:space="preserve"> trong bảng </w:t>
       </w:r>
       <w:r>
         <w:rPr>

</xml_diff>